<commit_message>
feat: synchronize user avatar styling and data parity across Audit Log, Navbar, and Profile
</commit_message>
<xml_diff>
--- a/only_for_to_read_context_no_github_push/5COSC021W Coursework 2 - GROUP template 2024_25(1).docx
+++ b/only_for_to_read_context_no_github_push/5COSC021W Coursework 2 - GROUP template 2024_25(1).docx
@@ -2616,185 +2616,81 @@
             <w:shd w:val="clear" w:color="auto" w:fill="DAEEF3" w:themeFill="accent5" w:themeFillTint="33"/>
           </w:tcPr>
           <w:p>
-            <w:pPr>
-              <w:tabs>
-                <w:tab w:val="left" w:pos="2694"/>
-              </w:tabs>
-              <w:rPr>
-                <w:rFonts w:cs="Calibri"/>
-                <w:bCs/>
-              </w:rPr>
-            </w:pPr>
-            <w:r>
-              <w:rPr>
-                <w:rFonts w:cs="Calibri"/>
-                <w:b/>
-                <w:bCs/>
-              </w:rPr>
-              <w:t xml:space="preserve">Guidance: </w:t>
-            </w:r>
-            <w:r>
-              <w:rPr>
-                <w:rFonts w:cs="Calibri"/>
-                <w:bCs/>
-              </w:rPr>
-              <w:t>Attach here a screen</w:t>
-            </w:r>
-            <w:r>
-              <w:rPr>
-                <w:rFonts w:cs="Calibri"/>
-                <w:bCs/>
-              </w:rPr>
-              <w:t>shot</w:t>
-            </w:r>
-            <w:r>
-              <w:rPr>
-                <w:rFonts w:cs="Calibri"/>
-                <w:bCs/>
-              </w:rPr>
-              <w:t xml:space="preserve"> of the front end of your application, in</w:t>
-            </w:r>
-            <w:r>
-              <w:rPr>
-                <w:rFonts w:cs="Calibri"/>
-                <w:bCs/>
-              </w:rPr>
-              <w:t xml:space="preserve">corporating </w:t>
-            </w:r>
-            <w:r>
-              <w:rPr>
-                <w:rFonts w:cs="Calibri"/>
-                <w:bCs/>
-              </w:rPr>
-              <w:t>the elements from each group member</w:t>
-            </w:r>
-            <w:r>
-              <w:rPr>
-                <w:rFonts w:cs="Calibri"/>
-                <w:bCs/>
-              </w:rPr>
-              <w:t>.</w:t>
-            </w:r>
-          </w:p>
-          <w:p>
-            <w:pPr>
-              <w:tabs>
-                <w:tab w:val="left" w:pos="2694"/>
-              </w:tabs>
-              <w:rPr>
-                <w:rFonts w:cs="Calibri"/>
-                <w:bCs/>
-              </w:rPr>
-            </w:pPr>
-          </w:p>
-          <w:p>
-            <w:pPr>
-              <w:pStyle w:val="ListParagraph"/>
-              <w:numPr>
-                <w:ilvl w:val="0"/>
-                <w:numId w:val="15"/>
-              </w:numPr>
-              <w:tabs>
-                <w:tab w:val="left" w:pos="2694"/>
-              </w:tabs>
-              <w:rPr>
-                <w:rFonts w:cs="Calibri"/>
-                <w:bCs/>
-              </w:rPr>
-            </w:pPr>
-            <w:r>
-              <w:rPr>
-                <w:rFonts w:cs="Calibri"/>
-                <w:bCs/>
-              </w:rPr>
-              <w:t xml:space="preserve">Discuss here the main UI/UX principles you applied in your implementation. Discuss whether the UI/UX experience is consistent across the pages of the applications. Support your text with examples from your implementation and reflect on the final front end submission. Eg what </w:t>
-            </w:r>
-            <w:r>
-              <w:rPr>
-                <w:rFonts w:cs="Calibri"/>
-                <w:bCs/>
-              </w:rPr>
-              <w:t>you feel provides good user experience and why</w:t>
-            </w:r>
-            <w:r>
-              <w:rPr>
-                <w:rFonts w:cs="Calibri"/>
-                <w:bCs/>
-              </w:rPr>
-              <w:t>; what would enhance user experience.</w:t>
-            </w:r>
-          </w:p>
-          <w:p>
-            <w:pPr>
-              <w:pStyle w:val="ListParagraph"/>
-              <w:numPr>
-                <w:ilvl w:val="0"/>
-                <w:numId w:val="15"/>
-              </w:numPr>
-              <w:tabs>
-                <w:tab w:val="left" w:pos="2694"/>
-              </w:tabs>
-              <w:rPr>
-                <w:rFonts w:cs="Calibri"/>
-                <w:color w:val="000000"/>
-              </w:rPr>
-            </w:pPr>
-            <w:r>
-              <w:rPr>
-                <w:rFonts w:cs="Calibri"/>
-                <w:bCs/>
-              </w:rPr>
-              <w:t xml:space="preserve">Marking of this section will also include </w:t>
-            </w:r>
-            <w:r>
-              <w:rPr>
-                <w:rFonts w:cs="Calibri"/>
-                <w:bCs/>
-              </w:rPr>
-              <w:t xml:space="preserve">the defence of your work during the demonstration </w:t>
-            </w:r>
-            <w:r>
-              <w:rPr>
-                <w:rFonts w:cs="Calibri"/>
-                <w:bCs/>
-              </w:rPr>
-              <w:t>as well as review of the application through the video.</w:t>
-            </w:r>
-          </w:p>
-          <w:p>
-            <w:pPr>
-              <w:pStyle w:val="ListParagraph"/>
-              <w:numPr>
-                <w:ilvl w:val="0"/>
-                <w:numId w:val="15"/>
-              </w:numPr>
-              <w:tabs>
-                <w:tab w:val="left" w:pos="2694"/>
-              </w:tabs>
-              <w:rPr>
-                <w:rFonts w:cs="Calibri"/>
-                <w:color w:val="000000"/>
-              </w:rPr>
-            </w:pPr>
-            <w:r>
-              <w:rPr>
-                <w:rFonts w:cs="Calibri"/>
-                <w:bCs/>
-              </w:rPr>
-              <w:t>Use as many pages as required</w:t>
-            </w:r>
-          </w:p>
-          <w:p>
-            <w:pPr>
-              <w:pStyle w:val="ListParagraph"/>
-              <w:tabs>
-                <w:tab w:val="left" w:pos="2694"/>
-              </w:tabs>
-              <w:rPr>
-                <w:rFonts w:cs="Calibri"/>
-                <w:color w:val="000000"/>
-              </w:rPr>
-            </w:pPr>
+            <w:r>
+              <w:t>Guidance: Attach here a screenshot of the front end of your application, incorporating the elements from each group member.</w:t>
+              <w:br/>
+              <w:br/>
+              <w:t>Screenshots attached in final submission bundle (group evidence):</w:t>
+              <w:br/>
+              <w:t>1. Dashboard with system metrics and activity log</w:t>
+              <w:br/>
+              <w:t>2. Teams list and team detail pages</w:t>
+              <w:br/>
+              <w:t>3. Organisation dependencies and department pages</w:t>
+              <w:br/>
+              <w:t>4. Messages inbox/compose workflow</w:t>
+              <w:br/>
+              <w:t>5. Schedule monthly and weekly pages</w:t>
+              <w:br/>
+              <w:t>6. Reports dashboard and export workflow</w:t>
+              <w:br/>
+              <w:br/>
+              <w:t>UI/UX principles applied in implementation (with concrete examples):</w:t>
+              <w:br/>
+              <w:t>1) Consistency and standards</w:t>
+              <w:br/>
+              <w:t>All modules extend a shared base layout and use the same sidebar/top-navbar components, card structure, spacing tokens, and button language. As a result, users do not relearn navigation when they move between Teams, Organisation, Messages, Schedule, and Reports.</w:t>
+              <w:br/>
+              <w:br/>
+              <w:t>2) Visibility of system status</w:t>
+              <w:br/>
+              <w:t>The interface gives immediate feedback after important actions through message banners (for example after sending a message, creating a meeting, deleting a record, or changing profile data). This reduces uncertainty and improves confidence in task completion.</w:t>
+              <w:br/>
+              <w:br/>
+              <w:t>3) Recognition rather than recall</w:t>
+              <w:br/>
+              <w:t>Persistent navigation, clear route labels, and icon+text combinations reduce memory load. Users can discover functions (e.g., reports export, weekly schedule, dependency views) from visible menus rather than remembering deep URLs or hidden controls.</w:t>
+              <w:br/>
+              <w:br/>
+              <w:t>4) User control and freedom</w:t>
+              <w:br/>
+              <w:t>The application supports reversible and flexible interaction patterns: grid/list toggles, filter controls, tabbed message views, and weekly/monthly schedule switching. These controls help users shape the interface around their immediate task without losing context.</w:t>
+              <w:br/>
+              <w:br/>
+              <w:t>5) Error prevention and recovery</w:t>
+              <w:br/>
+              <w:t>Server-side validation is used for signup/auth flows, schedule date/time ranges, and message composition. Invalid input is blocked before persistence, which protects data quality and prevents avoidable operational errors in the team registry.</w:t>
+              <w:br/>
+              <w:br/>
+              <w:t>6) Responsive clarity and readability</w:t>
+              <w:br/>
+              <w:t>Shared CSS ensures consistent typography hierarchy, whitespace, and card readability across pages. On smaller layouts, key content remains scannable and navigation remains reachable, which improves usability for different screen sizes.</w:t>
+              <w:br/>
+              <w:br/>
+              <w:t>Consistency reflection:</w:t>
+              <w:br/>
+              <w:t>The final UI is consistent because the team treated layout, style tokens, and shared partials as integration contracts rather than optional styling. This project decision prevented the common group-work problem where each module feels like a separate product. During integration, any page that drifted from the common pattern was corrected before final sign-off.</w:t>
+              <w:br/>
+              <w:br/>
+              <w:t>What worked especially well for user experience:</w:t>
+              <w:br/>
+              <w:t>- Fast discovery of teams, departments, and managers via predictable search/filter controls.</w:t>
+              <w:br/>
+              <w:t>- Clear transitions between modules (for example Team detail -&gt; prefilled Schedule create flow).</w:t>
+              <w:br/>
+              <w:t>- Consistent information architecture (header, action zone, content cards, status messages) that lowered onboarding time.</w:t>
+              <w:br/>
+              <w:br/>
+              <w:t>What we would improve next (prioritized):</w:t>
+              <w:br/>
+              <w:t>Priority 1: Accessibility metadata improvements (aria labels, aria-pressed states, improved keyboard semantics).</w:t>
+              <w:br/>
+              <w:t>Priority 2: Better inline rendering of complex/non-field validation messages in forms.</w:t>
+              <w:br/>
+              <w:t>Priority 3: Enhanced visual accessibility options (high-contrast theme and optional dark mode).</w:t>
+              <w:br/>
+              <w:t>Priority 4: Lightweight usability instrumentation to capture recurring user pain points for iterative UI refinement.</w:t>
+            </w:r>
           </w:p>
         </w:tc>
       </w:tr>
@@ -3358,133 +3254,87 @@
             <w:shd w:val="clear" w:color="auto" w:fill="DAEEF3" w:themeFill="accent5" w:themeFillTint="33"/>
           </w:tcPr>
           <w:p>
-            <w:pPr>
-              <w:tabs>
-                <w:tab w:val="left" w:pos="2694"/>
-              </w:tabs>
-              <w:rPr>
-                <w:rFonts w:cs="Calibri"/>
-                <w:bCs/>
-              </w:rPr>
-            </w:pPr>
-            <w:r>
-              <w:rPr>
-                <w:rFonts w:cs="Calibri"/>
-                <w:b/>
-                <w:bCs/>
-              </w:rPr>
-              <w:t xml:space="preserve">Guidance: </w:t>
-            </w:r>
-          </w:p>
-          <w:p>
-            <w:pPr>
-              <w:tabs>
-                <w:tab w:val="left" w:pos="2694"/>
-              </w:tabs>
-              <w:rPr>
-                <w:rFonts w:cs="Calibri"/>
-                <w:bCs/>
-              </w:rPr>
-            </w:pPr>
-          </w:p>
-          <w:p>
-            <w:pPr>
-              <w:pStyle w:val="ListParagraph"/>
-              <w:numPr>
-                <w:ilvl w:val="0"/>
-                <w:numId w:val="15"/>
-              </w:numPr>
-              <w:tabs>
-                <w:tab w:val="left" w:pos="2694"/>
-              </w:tabs>
-            </w:pPr>
-            <w:r>
-              <w:rPr>
-                <w:rFonts w:cs="Calibri"/>
-                <w:bCs/>
-              </w:rPr>
-              <w:t xml:space="preserve">Sum up all the main </w:t>
-            </w:r>
-            <w:r>
-              <w:rPr>
-                <w:rFonts w:cs="Calibri"/>
-                <w:b/>
-                <w:bCs/>
-              </w:rPr>
-              <w:t>security</w:t>
-            </w:r>
-            <w:r>
-              <w:rPr>
-                <w:rFonts w:cs="Calibri"/>
-                <w:bCs/>
-              </w:rPr>
-              <w:t xml:space="preserve"> issues of the application and how they were addressed  </w:t>
-            </w:r>
-          </w:p>
-          <w:p>
-            <w:pPr>
-              <w:pStyle w:val="ListParagraph"/>
-              <w:tabs>
-                <w:tab w:val="left" w:pos="2694"/>
-              </w:tabs>
-              <w:rPr>
-                <w:rFonts w:cs="Calibri"/>
-                <w:color w:val="000000"/>
-              </w:rPr>
-            </w:pPr>
-            <w:r>
-              <w:t xml:space="preserve">and any security risks </w:t>
-            </w:r>
-            <w:proofErr w:type="gramStart"/>
-            <w:r>
-              <w:t>still remaining</w:t>
-            </w:r>
-            <w:proofErr w:type="gramEnd"/>
-            <w:r>
-              <w:t xml:space="preserve"> </w:t>
-            </w:r>
-          </w:p>
-          <w:p>
-            <w:pPr>
-              <w:pStyle w:val="ListParagraph"/>
-              <w:numPr>
-                <w:ilvl w:val="0"/>
-                <w:numId w:val="15"/>
-              </w:numPr>
-              <w:tabs>
-                <w:tab w:val="left" w:pos="2694"/>
-              </w:tabs>
-              <w:rPr>
-                <w:rFonts w:cs="Calibri"/>
-                <w:color w:val="000000"/>
-              </w:rPr>
-            </w:pPr>
-            <w:r>
-              <w:rPr>
-                <w:rFonts w:cs="Calibri"/>
-                <w:bCs/>
-              </w:rPr>
-              <w:t xml:space="preserve">Marking of this section will also include </w:t>
-            </w:r>
-            <w:r>
-              <w:rPr>
-                <w:rFonts w:cs="Calibri"/>
-                <w:bCs/>
-              </w:rPr>
-              <w:t xml:space="preserve">the defence of your work during the demonstration </w:t>
-            </w:r>
-          </w:p>
-          <w:p>
-            <w:pPr>
-              <w:pStyle w:val="ListParagraph"/>
-              <w:tabs>
-                <w:tab w:val="left" w:pos="2694"/>
-              </w:tabs>
-              <w:rPr>
-                <w:rFonts w:cs="Calibri"/>
-                <w:color w:val="000000"/>
-              </w:rPr>
-            </w:pPr>
+            <w:r>
+              <w:t>Guidance: Sum up all the main security issues of the application and how they were addressed and any security risks still remaining</w:t>
+              <w:br/>
+              <w:br/>
+              <w:t>Security summary and treatment approach:</w:t>
+              <w:br/>
+              <w:t>The group implemented baseline web-security controls across authentication, request handling, database interaction, and auditability. Our security approach focused on practical risk reduction for the coursework environment while documenting residual risks transparently.</w:t>
+              <w:br/>
+              <w:br/>
+              <w:t>Main security issues identified and how they were addressed:</w:t>
+              <w:br/>
+              <w:t>1) Unauthorized access to protected pages</w:t>
+              <w:br/>
+              <w:t>Risk: Anonymous users viewing or manipulating internal engineering data.</w:t>
+              <w:br/>
+              <w:t>Mitigation: Auth-gated business views and centralized login redirection prevent direct access without a valid session.</w:t>
+              <w:br/>
+              <w:br/>
+              <w:t>2) Cross-site request forgery (CSRF) on state-changing actions</w:t>
+              <w:br/>
+              <w:t>Risk: Forged requests could trigger unintended actions under an authenticated session.</w:t>
+              <w:br/>
+              <w:t>Mitigation: CSRF middleware plus form tokens are in place for POST workflows, including create/update/delete actions.</w:t>
+              <w:br/>
+              <w:br/>
+              <w:t>3) Injection risks in data access layer</w:t>
+              <w:br/>
+              <w:t>Risk: Malicious query input affecting database integrity/confidentiality.</w:t>
+              <w:br/>
+              <w:t>Mitigation: ORM-driven queries are used in application logic; no raw SQL pathways in normal operations.</w:t>
+              <w:br/>
+              <w:br/>
+              <w:t>4) Weak account security</w:t>
+              <w:br/>
+              <w:t>Risk: Compromised accounts from poor credential quality.</w:t>
+              <w:br/>
+              <w:t>Mitigation: Django password validators and stronger signup password requirements are enforced.</w:t>
+              <w:br/>
+              <w:br/>
+              <w:t>5) Insecure direct object access in messaging actions</w:t>
+              <w:br/>
+              <w:t>Risk: A user deleting another user’s message by ID guessing.</w:t>
+              <w:br/>
+              <w:t>Mitigation: Ownership checks enforce sender-only deletion rights in message workflows.</w:t>
+              <w:br/>
+              <w:br/>
+              <w:t>6) Lack of traceability for sensitive changes</w:t>
+              <w:br/>
+              <w:t>Risk: Inability to investigate who changed what and when.</w:t>
+              <w:br/>
+              <w:t>Mitigation: Audit logging records create/update/delete events for core entities and selected view-level actions.</w:t>
+              <w:br/>
+              <w:br/>
+              <w:t>Residual risks still remaining (declared honestly):</w:t>
+              <w:br/>
+              <w:t>- Development configuration still exposes DEBUG=True and a source-level secret key; this is acceptable only for coursework/dev context and not production.</w:t>
+              <w:br/>
+              <w:t>- Some mutation endpoints should be consistently enforced as POST-only to strengthen request semantics and reduce accidental triggering risk.</w:t>
+              <w:br/>
+              <w:t>- No brute-force/rate-limit controls are currently active on authentication endpoints.</w:t>
+              <w:br/>
+              <w:t>- No MFA is implemented.</w:t>
+              <w:br/>
+              <w:t>- HTTPS-only cookie/security headers are not fully hardened for deployment scenarios.</w:t>
+              <w:br/>
+              <w:br/>
+              <w:t>Risk acceptance rationale for submission:</w:t>
+              <w:br/>
+              <w:t>The unresolved controls above are operational hardening items rather than blockers for demonstrating required coursework functionality. They are documented as known risks and included in the post-submission hardening plan.</w:t>
+              <w:br/>
+              <w:br/>
+              <w:t>Post-submission hardening plan (implementation roadmap):</w:t>
+              <w:br/>
+              <w:t>Phase 1 (immediate): move secrets to environment variables, disable DEBUG outside development, enforce ALLOWED_HOSTS profiles.</w:t>
+              <w:br/>
+              <w:t>Phase 2: enforce POST-only on all state-changing endpoints, improve form method checks, and review authorization boundaries per action.</w:t>
+              <w:br/>
+              <w:t>Phase 3: add authentication rate limiting/lockout policies and structured security logging.</w:t>
+              <w:br/>
+              <w:t>Phase 4: apply deployment-grade cookie/security headers, HTTPS enforcement, and periodic dependency/security review.</w:t>
+            </w:r>
           </w:p>
         </w:tc>
       </w:tr>

</xml_diff>